<commit_message>
Sync from Drive (content + courses.json)
</commit_message>
<xml_diff>
--- a/content/CO0001/CO0001 – CPD objectives.docx
+++ b/content/CO0001/CO0001 – CPD objectives.docx
@@ -423,8 +423,10 @@
             </w:pPr>
             <w:r>
               <w:rPr>
-                <w:rtl w:val="0"/>
-              </w:rPr>
+                <w:highlight w:val="white"/>
+                <w:rtl w:val="0"/>
+              </w:rPr>
+              <w:t xml:space="preserve">Test</w:t>
             </w:r>
           </w:p>
         </w:tc>
@@ -621,11 +623,15 @@
               <w:ind w:left="0" w:right="0" w:firstLine="0"/>
               <w:jc w:val="left"/>
               <w:rPr>
-                <w:highlight w:val="white"/>
-              </w:rPr>
-            </w:pPr>
-            <w:r>
-              <w:rPr>
+                <w:b w:val="1"/>
+                <w:bCs w:val="1"/>
+                <w:highlight w:val="white"/>
+              </w:rPr>
+            </w:pPr>
+            <w:r>
+              <w:rPr>
+                <w:b w:val="1"/>
+                <w:bCs w:val="1"/>
                 <w:highlight w:val="white"/>
                 <w:rtl w:val="0"/>
               </w:rPr>
@@ -707,15 +713,19 @@
               <w:ind w:left="0" w:right="0" w:firstLine="0"/>
               <w:jc w:val="left"/>
               <w:rPr>
-                <w:highlight w:val="white"/>
-              </w:rPr>
-            </w:pPr>
-            <w:r>
-              <w:rPr>
-                <w:highlight w:val="white"/>
-                <w:rtl w:val="0"/>
-              </w:rPr>
-              <w:t xml:space="preserve">d</w:t>
+                <w:sz w:val="54"/>
+                <w:szCs w:val="54"/>
+                <w:highlight w:val="white"/>
+              </w:rPr>
+            </w:pPr>
+            <w:r>
+              <w:rPr>
+                <w:sz w:val="54"/>
+                <w:szCs w:val="54"/>
+                <w:highlight w:val="white"/>
+                <w:rtl w:val="0"/>
+              </w:rPr>
+              <w:t xml:space="preserve">dTest</w:t>
             </w:r>
           </w:p>
         </w:tc>
@@ -814,29 +824,25 @@
           </w:tcPr>
           <w:p>
             <w:pPr>
-              <w:keepNext w:val="0"/>
-              <w:keepLines w:val="0"/>
-              <w:pageBreakBefore w:val="0"/>
-              <w:widowControl w:val="0"/>
-              <w:pBdr>
-                <w:top w:space="0" w:sz="0" w:val="nil"/>
-                <w:left w:space="0" w:sz="0" w:val="nil"/>
-                <w:bottom w:space="0" w:sz="0" w:val="nil"/>
-                <w:right w:space="0" w:sz="0" w:val="nil"/>
-                <w:between w:space="0" w:sz="0" w:val="nil"/>
-              </w:pBdr>
-              <w:shd w:fill="auto" w:val="clear"/>
-              <w:spacing w:after="0" w:before="0" w:line="240" w:lineRule="auto"/>
-              <w:ind w:left="0" w:right="0" w:firstLine="0"/>
-              <w:jc w:val="left"/>
-              <w:rPr>
-                <w:highlight w:val="white"/>
-              </w:rPr>
-            </w:pPr>
-            <w:r>
-              <w:rPr>
-                <w:rtl w:val="0"/>
-              </w:rPr>
+              <w:spacing w:line="240" w:lineRule="auto"/>
+              <w:rPr>
+                <w:b w:val="1"/>
+                <w:bCs w:val="1"/>
+                <w:sz w:val="34"/>
+                <w:szCs w:val="34"/>
+                <w:highlight w:val="white"/>
+              </w:rPr>
+            </w:pPr>
+            <w:r>
+              <w:rPr>
+                <w:b w:val="1"/>
+                <w:bCs w:val="1"/>
+                <w:sz w:val="34"/>
+                <w:szCs w:val="34"/>
+                <w:highlight w:val="white"/>
+                <w:rtl w:val="0"/>
+              </w:rPr>
+              <w:t xml:space="preserve">Test</w:t>
             </w:r>
           </w:p>
         </w:tc>
@@ -1021,29 +1027,21 @@
           </w:tcPr>
           <w:p>
             <w:pPr>
-              <w:keepNext w:val="0"/>
-              <w:keepLines w:val="0"/>
-              <w:pageBreakBefore w:val="0"/>
-              <w:widowControl w:val="0"/>
-              <w:pBdr>
-                <w:top w:space="0" w:sz="0" w:val="nil"/>
-                <w:left w:space="0" w:sz="0" w:val="nil"/>
-                <w:bottom w:space="0" w:sz="0" w:val="nil"/>
-                <w:right w:space="0" w:sz="0" w:val="nil"/>
-                <w:between w:space="0" w:sz="0" w:val="nil"/>
-              </w:pBdr>
-              <w:shd w:fill="auto" w:val="clear"/>
-              <w:spacing w:after="0" w:before="0" w:line="240" w:lineRule="auto"/>
-              <w:ind w:left="0" w:right="0" w:firstLine="0"/>
-              <w:jc w:val="left"/>
-              <w:rPr>
-                <w:highlight w:val="white"/>
-              </w:rPr>
-            </w:pPr>
-            <w:r>
-              <w:rPr>
-                <w:rtl w:val="0"/>
-              </w:rPr>
+              <w:spacing w:line="240" w:lineRule="auto"/>
+              <w:rPr>
+                <w:b w:val="1"/>
+                <w:bCs w:val="1"/>
+                <w:highlight w:val="white"/>
+              </w:rPr>
+            </w:pPr>
+            <w:r>
+              <w:rPr>
+                <w:b w:val="1"/>
+                <w:bCs w:val="1"/>
+                <w:highlight w:val="white"/>
+                <w:rtl w:val="0"/>
+              </w:rPr>
+              <w:t xml:space="preserve">Test</w:t>
             </w:r>
           </w:p>
         </w:tc>

</xml_diff>